<commit_message>
implemented the magang program
</commit_message>
<xml_diff>
--- a/public/doc-templates/Magang/kelayakan-magang.docx
+++ b/public/doc-templates/Magang/kelayakan-magang.docx
@@ -940,8 +940,12 @@
       </w:pPr>
     </w:p>
     <w:sectPr>
-      <w:headerReference w:type="default" r:id="rId8"/>
-      <w:footerReference w:type="default" r:id="rId9"/>
+      <w:headerReference w:type="even" r:id="rId8"/>
+      <w:headerReference w:type="default" r:id="rId9"/>
+      <w:footerReference w:type="even" r:id="rId10"/>
+      <w:footerReference w:type="default" r:id="rId11"/>
+      <w:headerReference w:type="first" r:id="rId12"/>
+      <w:footerReference w:type="first" r:id="rId13"/>
       <w:pgSz w:w="11906" w:h="16838" w:code="9"/>
       <w:pgMar w:top="1440" w:right="1440" w:bottom="1440" w:left="1440" w:header="270" w:footer="900" w:gutter="0"/>
       <w:cols w:space="720"/>
@@ -977,6 +981,16 @@
 </file>
 
 <file path=word/footer1.xml><?xml version="1.0" encoding="utf-8"?>
+<w:ftr xmlns:wpc="http://schemas.microsoft.com/office/word/2010/wordprocessingCanvas" xmlns:cx="http://schemas.microsoft.com/office/drawing/2014/chartex" xmlns:cx1="http://schemas.microsoft.com/office/drawing/2015/9/8/chartex" xmlns:cx2="http://schemas.microsoft.com/office/drawing/2015/10/21/chartex" xmlns:cx3="http://schemas.microsoft.com/office/drawing/2016/5/9/chartex" xmlns:cx4="http://schemas.microsoft.com/office/drawing/2016/5/10/chartex" xmlns:cx5="http://schemas.microsoft.com/office/drawing/2016/5/11/chartex" xmlns:cx6="http://schemas.microsoft.com/office/drawing/2016/5/12/chartex" xmlns:cx7="http://schemas.microsoft.com/office/drawing/2016/5/13/chartex" xmlns:cx8="http://schemas.microsoft.com/office/drawing/2016/5/14/chartex" xmlns:mc="http://schemas.openxmlformats.org/markup-compatibility/2006" xmlns:aink="http://schemas.microsoft.com/office/drawing/2016/ink" xmlns:am3d="http://schemas.microsoft.com/office/drawing/2017/model3d" xmlns:o="urn:schemas-microsoft-com:office:office" xmlns:oel="http://schemas.microsoft.com/office/2019/extlst" xmlns:r="http://schemas.openxmlformats.org/officeDocument/2006/relationships" xmlns:m="http://schemas.openxmlformats.org/officeDocument/2006/math" xmlns:v="urn:schemas-microsoft-com:vml" xmlns:wp14="http://schemas.microsoft.com/office/word/2010/wordprocessingDrawing" xmlns:wp="http://schemas.openxmlformats.org/drawingml/2006/wordprocessingDrawing" xmlns:w10="urn:schemas-microsoft-com:office:word" xmlns:w="http://schemas.openxmlformats.org/wordprocessingml/2006/main" xmlns:w14="http://schemas.microsoft.com/office/word/2010/wordml" xmlns:w15="http://schemas.microsoft.com/office/word/2012/wordml" xmlns:w16cex="http://schemas.microsoft.com/office/word/2018/wordml/cex" xmlns:w16cid="http://schemas.microsoft.com/office/word/2016/wordml/cid" xmlns:w16="http://schemas.microsoft.com/office/word/2018/wordml" xmlns:w16du="http://schemas.microsoft.com/office/word/2023/wordml/word16du" xmlns:w16sdtdh="http://schemas.microsoft.com/office/word/2020/wordml/sdtdatahash" xmlns:w16sdtfl="http://schemas.microsoft.com/office/word/2024/wordml/sdtformatlock" xmlns:w16se="http://schemas.microsoft.com/office/word/2015/wordml/symex" xmlns:wpg="http://schemas.microsoft.com/office/word/2010/wordprocessingGroup" xmlns:wpi="http://schemas.microsoft.com/office/word/2010/wordprocessingInk" xmlns:wne="http://schemas.microsoft.com/office/word/2006/wordml" xmlns:wps="http://schemas.microsoft.com/office/word/2010/wordprocessingShape" mc:Ignorable="w14 w15 w16se w16cid w16 w16cex w16sdtdh w16sdtfl w16du wp14">
+  <w:p>
+    <w:pPr>
+      <w:pStyle w:val="Footer"/>
+    </w:pPr>
+  </w:p>
+</w:ftr>
+</file>
+
+<file path=word/footer2.xml><?xml version="1.0" encoding="utf-8"?>
 <w:ftr xmlns:wpc="http://schemas.microsoft.com/office/word/2010/wordprocessingCanvas" xmlns:cx="http://schemas.microsoft.com/office/drawing/2014/chartex" xmlns:cx1="http://schemas.microsoft.com/office/drawing/2015/9/8/chartex" xmlns:cx2="http://schemas.microsoft.com/office/drawing/2015/10/21/chartex" xmlns:cx3="http://schemas.microsoft.com/office/drawing/2016/5/9/chartex" xmlns:cx4="http://schemas.microsoft.com/office/drawing/2016/5/10/chartex" xmlns:cx5="http://schemas.microsoft.com/office/drawing/2016/5/11/chartex" xmlns:cx6="http://schemas.microsoft.com/office/drawing/2016/5/12/chartex" xmlns:cx7="http://schemas.microsoft.com/office/drawing/2016/5/13/chartex" xmlns:cx8="http://schemas.microsoft.com/office/drawing/2016/5/14/chartex" xmlns:mc="http://schemas.openxmlformats.org/markup-compatibility/2006" xmlns:aink="http://schemas.microsoft.com/office/drawing/2016/ink" xmlns:am3d="http://schemas.microsoft.com/office/drawing/2017/model3d" xmlns:o="urn:schemas-microsoft-com:office:office" xmlns:oel="http://schemas.microsoft.com/office/2019/extlst" xmlns:r="http://schemas.openxmlformats.org/officeDocument/2006/relationships" xmlns:m="http://schemas.openxmlformats.org/officeDocument/2006/math" xmlns:v="urn:schemas-microsoft-com:vml" xmlns:wp14="http://schemas.microsoft.com/office/word/2010/wordprocessingDrawing" xmlns:wp="http://schemas.openxmlformats.org/drawingml/2006/wordprocessingDrawing" xmlns:w10="urn:schemas-microsoft-com:office:word" xmlns:w="http://schemas.openxmlformats.org/wordprocessingml/2006/main" xmlns:w14="http://schemas.microsoft.com/office/word/2010/wordml" xmlns:w15="http://schemas.microsoft.com/office/word/2012/wordml" xmlns:w16cex="http://schemas.microsoft.com/office/word/2018/wordml/cex" xmlns:w16cid="http://schemas.microsoft.com/office/word/2016/wordml/cid" xmlns:w16="http://schemas.microsoft.com/office/word/2018/wordml" xmlns:w16du="http://schemas.microsoft.com/office/word/2023/wordml/word16du" xmlns:w16sdtdh="http://schemas.microsoft.com/office/word/2020/wordml/sdtdatahash" xmlns:w16sdtfl="http://schemas.microsoft.com/office/word/2024/wordml/sdtformatlock" xmlns:w16se="http://schemas.microsoft.com/office/word/2015/wordml/symex" xmlns:wpg="http://schemas.microsoft.com/office/word/2010/wordprocessingGroup" xmlns:wpi="http://schemas.microsoft.com/office/word/2010/wordprocessingInk" xmlns:wne="http://schemas.microsoft.com/office/word/2006/wordml" xmlns:wps="http://schemas.microsoft.com/office/word/2010/wordprocessingShape" mc:Ignorable="w14 w15 w16se w16cid w16 w16cex w16sdtdh w16sdtfl w16du wp14">
   <w:bookmarkStart w:id="2" w:name="_Hlk32345472"/>
   <w:bookmarkStart w:id="3" w:name="_Hlk32345473"/>
@@ -1071,6 +1085,7 @@
         </mc:Fallback>
       </mc:AlternateContent>
     </w:r>
+    <w:proofErr w:type="spellStart"/>
     <w:r>
       <w:rPr>
         <w:rFonts w:ascii="Times New Roman" w:hAnsi="Times New Roman" w:cs="Times New Roman"/>
@@ -1079,6 +1094,7 @@
       </w:rPr>
       <w:t>Dicetak</w:t>
     </w:r>
+    <w:proofErr w:type="spellEnd"/>
     <w:r>
       <w:rPr>
         <w:rFonts w:ascii="Times New Roman" w:hAnsi="Times New Roman" w:cs="Times New Roman"/>
@@ -1087,13 +1103,23 @@
       </w:rPr>
       <w:t xml:space="preserve"> </w:t>
     </w:r>
+    <w:proofErr w:type="spellStart"/>
     <w:r>
       <w:rPr>
         <w:rFonts w:ascii="Times New Roman" w:hAnsi="Times New Roman" w:cs="Times New Roman"/>
         <w:sz w:val="18"/>
         <w:szCs w:val="18"/>
       </w:rPr>
-      <w:t>tgl:</w:t>
+      <w:t>tgl</w:t>
+    </w:r>
+    <w:proofErr w:type="spellEnd"/>
+    <w:r>
+      <w:rPr>
+        <w:rFonts w:ascii="Times New Roman" w:hAnsi="Times New Roman" w:cs="Times New Roman"/>
+        <w:sz w:val="18"/>
+        <w:szCs w:val="18"/>
+      </w:rPr>
+      <w:t>:</w:t>
     </w:r>
     <w:bookmarkEnd w:id="2"/>
     <w:bookmarkEnd w:id="3"/>
@@ -1103,8 +1129,36 @@
         <w:sz w:val="18"/>
         <w:szCs w:val="18"/>
       </w:rPr>
-      <w:t xml:space="preserve"> {tgl_cetak}</w:t>
+      <w:t xml:space="preserve"> {</w:t>
     </w:r>
+    <w:proofErr w:type="spellStart"/>
+    <w:r>
+      <w:rPr>
+        <w:rFonts w:ascii="Times New Roman" w:hAnsi="Times New Roman" w:cs="Times New Roman"/>
+        <w:sz w:val="18"/>
+        <w:szCs w:val="18"/>
+      </w:rPr>
+      <w:t>tgl_cetak</w:t>
+    </w:r>
+    <w:proofErr w:type="spellEnd"/>
+    <w:r>
+      <w:rPr>
+        <w:rFonts w:ascii="Times New Roman" w:hAnsi="Times New Roman" w:cs="Times New Roman"/>
+        <w:sz w:val="18"/>
+        <w:szCs w:val="18"/>
+      </w:rPr>
+      <w:t>}</w:t>
+    </w:r>
+  </w:p>
+</w:ftr>
+</file>
+
+<file path=word/footer3.xml><?xml version="1.0" encoding="utf-8"?>
+<w:ftr xmlns:wpc="http://schemas.microsoft.com/office/word/2010/wordprocessingCanvas" xmlns:cx="http://schemas.microsoft.com/office/drawing/2014/chartex" xmlns:cx1="http://schemas.microsoft.com/office/drawing/2015/9/8/chartex" xmlns:cx2="http://schemas.microsoft.com/office/drawing/2015/10/21/chartex" xmlns:cx3="http://schemas.microsoft.com/office/drawing/2016/5/9/chartex" xmlns:cx4="http://schemas.microsoft.com/office/drawing/2016/5/10/chartex" xmlns:cx5="http://schemas.microsoft.com/office/drawing/2016/5/11/chartex" xmlns:cx6="http://schemas.microsoft.com/office/drawing/2016/5/12/chartex" xmlns:cx7="http://schemas.microsoft.com/office/drawing/2016/5/13/chartex" xmlns:cx8="http://schemas.microsoft.com/office/drawing/2016/5/14/chartex" xmlns:mc="http://schemas.openxmlformats.org/markup-compatibility/2006" xmlns:aink="http://schemas.microsoft.com/office/drawing/2016/ink" xmlns:am3d="http://schemas.microsoft.com/office/drawing/2017/model3d" xmlns:o="urn:schemas-microsoft-com:office:office" xmlns:oel="http://schemas.microsoft.com/office/2019/extlst" xmlns:r="http://schemas.openxmlformats.org/officeDocument/2006/relationships" xmlns:m="http://schemas.openxmlformats.org/officeDocument/2006/math" xmlns:v="urn:schemas-microsoft-com:vml" xmlns:wp14="http://schemas.microsoft.com/office/word/2010/wordprocessingDrawing" xmlns:wp="http://schemas.openxmlformats.org/drawingml/2006/wordprocessingDrawing" xmlns:w10="urn:schemas-microsoft-com:office:word" xmlns:w="http://schemas.openxmlformats.org/wordprocessingml/2006/main" xmlns:w14="http://schemas.microsoft.com/office/word/2010/wordml" xmlns:w15="http://schemas.microsoft.com/office/word/2012/wordml" xmlns:w16cex="http://schemas.microsoft.com/office/word/2018/wordml/cex" xmlns:w16cid="http://schemas.microsoft.com/office/word/2016/wordml/cid" xmlns:w16="http://schemas.microsoft.com/office/word/2018/wordml" xmlns:w16du="http://schemas.microsoft.com/office/word/2023/wordml/word16du" xmlns:w16sdtdh="http://schemas.microsoft.com/office/word/2020/wordml/sdtdatahash" xmlns:w16sdtfl="http://schemas.microsoft.com/office/word/2024/wordml/sdtformatlock" xmlns:w16se="http://schemas.microsoft.com/office/word/2015/wordml/symex" xmlns:wpg="http://schemas.microsoft.com/office/word/2010/wordprocessingGroup" xmlns:wpi="http://schemas.microsoft.com/office/word/2010/wordprocessingInk" xmlns:wne="http://schemas.microsoft.com/office/word/2006/wordml" xmlns:wps="http://schemas.microsoft.com/office/word/2010/wordprocessingShape" mc:Ignorable="w14 w15 w16se w16cid w16 w16cex w16sdtdh w16sdtfl w16du wp14">
+  <w:p>
+    <w:pPr>
+      <w:pStyle w:val="Footer"/>
+    </w:pPr>
   </w:p>
 </w:ftr>
 </file>
@@ -1135,6 +1189,16 @@
 </file>
 
 <file path=word/header1.xml><?xml version="1.0" encoding="utf-8"?>
+<w:hdr xmlns:wpc="http://schemas.microsoft.com/office/word/2010/wordprocessingCanvas" xmlns:cx="http://schemas.microsoft.com/office/drawing/2014/chartex" xmlns:cx1="http://schemas.microsoft.com/office/drawing/2015/9/8/chartex" xmlns:cx2="http://schemas.microsoft.com/office/drawing/2015/10/21/chartex" xmlns:cx3="http://schemas.microsoft.com/office/drawing/2016/5/9/chartex" xmlns:cx4="http://schemas.microsoft.com/office/drawing/2016/5/10/chartex" xmlns:cx5="http://schemas.microsoft.com/office/drawing/2016/5/11/chartex" xmlns:cx6="http://schemas.microsoft.com/office/drawing/2016/5/12/chartex" xmlns:cx7="http://schemas.microsoft.com/office/drawing/2016/5/13/chartex" xmlns:cx8="http://schemas.microsoft.com/office/drawing/2016/5/14/chartex" xmlns:mc="http://schemas.openxmlformats.org/markup-compatibility/2006" xmlns:aink="http://schemas.microsoft.com/office/drawing/2016/ink" xmlns:am3d="http://schemas.microsoft.com/office/drawing/2017/model3d" xmlns:o="urn:schemas-microsoft-com:office:office" xmlns:oel="http://schemas.microsoft.com/office/2019/extlst" xmlns:r="http://schemas.openxmlformats.org/officeDocument/2006/relationships" xmlns:m="http://schemas.openxmlformats.org/officeDocument/2006/math" xmlns:v="urn:schemas-microsoft-com:vml" xmlns:wp14="http://schemas.microsoft.com/office/word/2010/wordprocessingDrawing" xmlns:wp="http://schemas.openxmlformats.org/drawingml/2006/wordprocessingDrawing" xmlns:w10="urn:schemas-microsoft-com:office:word" xmlns:w="http://schemas.openxmlformats.org/wordprocessingml/2006/main" xmlns:w14="http://schemas.microsoft.com/office/word/2010/wordml" xmlns:w15="http://schemas.microsoft.com/office/word/2012/wordml" xmlns:w16cex="http://schemas.microsoft.com/office/word/2018/wordml/cex" xmlns:w16cid="http://schemas.microsoft.com/office/word/2016/wordml/cid" xmlns:w16="http://schemas.microsoft.com/office/word/2018/wordml" xmlns:w16du="http://schemas.microsoft.com/office/word/2023/wordml/word16du" xmlns:w16sdtdh="http://schemas.microsoft.com/office/word/2020/wordml/sdtdatahash" xmlns:w16sdtfl="http://schemas.microsoft.com/office/word/2024/wordml/sdtformatlock" xmlns:w16se="http://schemas.microsoft.com/office/word/2015/wordml/symex" xmlns:wpg="http://schemas.microsoft.com/office/word/2010/wordprocessingGroup" xmlns:wpi="http://schemas.microsoft.com/office/word/2010/wordprocessingInk" xmlns:wne="http://schemas.microsoft.com/office/word/2006/wordml" xmlns:wps="http://schemas.microsoft.com/office/word/2010/wordprocessingShape" mc:Ignorable="w14 w15 w16se w16cid w16 w16cex w16sdtdh w16sdtfl w16du wp14">
+  <w:p>
+    <w:pPr>
+      <w:pStyle w:val="Header"/>
+    </w:pPr>
+  </w:p>
+</w:hdr>
+</file>
+
+<file path=word/header2.xml><?xml version="1.0" encoding="utf-8"?>
 <w:hdr xmlns:wpc="http://schemas.microsoft.com/office/word/2010/wordprocessingCanvas" xmlns:cx="http://schemas.microsoft.com/office/drawing/2014/chartex" xmlns:cx1="http://schemas.microsoft.com/office/drawing/2015/9/8/chartex" xmlns:cx2="http://schemas.microsoft.com/office/drawing/2015/10/21/chartex" xmlns:cx3="http://schemas.microsoft.com/office/drawing/2016/5/9/chartex" xmlns:cx4="http://schemas.microsoft.com/office/drawing/2016/5/10/chartex" xmlns:cx5="http://schemas.microsoft.com/office/drawing/2016/5/11/chartex" xmlns:cx6="http://schemas.microsoft.com/office/drawing/2016/5/12/chartex" xmlns:cx7="http://schemas.microsoft.com/office/drawing/2016/5/13/chartex" xmlns:cx8="http://schemas.microsoft.com/office/drawing/2016/5/14/chartex" xmlns:mc="http://schemas.openxmlformats.org/markup-compatibility/2006" xmlns:aink="http://schemas.microsoft.com/office/drawing/2016/ink" xmlns:am3d="http://schemas.microsoft.com/office/drawing/2017/model3d" xmlns:o="urn:schemas-microsoft-com:office:office" xmlns:oel="http://schemas.microsoft.com/office/2019/extlst" xmlns:r="http://schemas.openxmlformats.org/officeDocument/2006/relationships" xmlns:m="http://schemas.openxmlformats.org/officeDocument/2006/math" xmlns:v="urn:schemas-microsoft-com:vml" xmlns:wp14="http://schemas.microsoft.com/office/word/2010/wordprocessingDrawing" xmlns:wp="http://schemas.openxmlformats.org/drawingml/2006/wordprocessingDrawing" xmlns:w10="urn:schemas-microsoft-com:office:word" xmlns:w="http://schemas.openxmlformats.org/wordprocessingml/2006/main" xmlns:w14="http://schemas.microsoft.com/office/word/2010/wordml" xmlns:w15="http://schemas.microsoft.com/office/word/2012/wordml" xmlns:w16cex="http://schemas.microsoft.com/office/word/2018/wordml/cex" xmlns:w16cid="http://schemas.microsoft.com/office/word/2016/wordml/cid" xmlns:w16="http://schemas.microsoft.com/office/word/2018/wordml" xmlns:w16du="http://schemas.microsoft.com/office/word/2023/wordml/word16du" xmlns:w16sdtdh="http://schemas.microsoft.com/office/word/2020/wordml/sdtdatahash" xmlns:w16sdtfl="http://schemas.microsoft.com/office/word/2024/wordml/sdtformatlock" xmlns:w16se="http://schemas.microsoft.com/office/word/2015/wordml/symex" xmlns:wpg="http://schemas.microsoft.com/office/word/2010/wordprocessingGroup" xmlns:wpi="http://schemas.microsoft.com/office/word/2010/wordprocessingInk" xmlns:wne="http://schemas.microsoft.com/office/word/2006/wordml" xmlns:wps="http://schemas.microsoft.com/office/word/2010/wordprocessingShape" mc:Ignorable="w14 w15 w16se w16cid w16 w16cex w16sdtdh w16sdtfl w16du wp14">
   <w:tbl>
     <w:tblPr>
@@ -1170,11 +1234,15 @@
             </w:tabs>
             <w:spacing w:before="240" w:after="240"/>
             <w:jc w:val="center"/>
+            <w:rPr>
+              <w:rFonts w:ascii="Times New Roman" w:hAnsi="Times New Roman" w:cs="Times New Roman"/>
+            </w:rPr>
           </w:pPr>
           <w:bookmarkStart w:id="0" w:name="_Hlk184387129"/>
           <w:bookmarkStart w:id="1" w:name="_Hlk184387130"/>
           <w:r>
             <w:rPr>
+              <w:rFonts w:ascii="Times New Roman" w:hAnsi="Times New Roman" w:cs="Times New Roman"/>
               <w:noProof/>
             </w:rPr>
             <w:drawing>
@@ -1235,7 +1303,7 @@
         <w:p>
           <w:pPr>
             <w:rPr>
-              <w:rFonts w:ascii="Times New Roman" w:hAnsi="Times New Roman"/>
+              <w:rFonts w:ascii="Times New Roman" w:hAnsi="Times New Roman" w:cs="Times New Roman"/>
               <w:b/>
               <w:color w:val="0070C0"/>
             </w:rPr>
@@ -1244,14 +1312,14 @@
         <w:p>
           <w:pPr>
             <w:rPr>
-              <w:rFonts w:ascii="Times New Roman" w:hAnsi="Times New Roman"/>
+              <w:rFonts w:ascii="Times New Roman" w:hAnsi="Times New Roman" w:cs="Times New Roman"/>
               <w:b/>
               <w:color w:val="0070C0"/>
             </w:rPr>
           </w:pPr>
           <w:r>
             <w:rPr>
-              <w:rFonts w:ascii="Times New Roman" w:hAnsi="Times New Roman"/>
+              <w:rFonts w:ascii="Times New Roman" w:hAnsi="Times New Roman" w:cs="Times New Roman"/>
               <w:b/>
               <w:color w:val="0070C0"/>
             </w:rPr>
@@ -1261,14 +1329,14 @@
         <w:p>
           <w:pPr>
             <w:rPr>
-              <w:rFonts w:ascii="Times New Roman" w:hAnsi="Times New Roman"/>
+              <w:rFonts w:ascii="Times New Roman" w:hAnsi="Times New Roman" w:cs="Times New Roman"/>
               <w:b/>
               <w:color w:val="0070C0"/>
             </w:rPr>
           </w:pPr>
           <w:r>
             <w:rPr>
-              <w:rFonts w:ascii="Times New Roman" w:hAnsi="Times New Roman"/>
+              <w:rFonts w:ascii="Times New Roman" w:hAnsi="Times New Roman" w:cs="Times New Roman"/>
               <w:b/>
               <w:color w:val="0070C0"/>
             </w:rPr>
@@ -1278,7 +1346,7 @@
         <w:p>
           <w:pPr>
             <w:rPr>
-              <w:rFonts w:ascii="Times New Roman" w:hAnsi="Times New Roman"/>
+              <w:rFonts w:ascii="Times New Roman" w:hAnsi="Times New Roman" w:cs="Times New Roman"/>
               <w:b/>
               <w:color w:val="0070C0"/>
               <w:sz w:val="24"/>
@@ -1287,7 +1355,7 @@
           </w:pPr>
           <w:r>
             <w:rPr>
-              <w:rFonts w:ascii="Times New Roman" w:hAnsi="Times New Roman"/>
+              <w:rFonts w:ascii="Times New Roman" w:hAnsi="Times New Roman" w:cs="Times New Roman"/>
               <w:b/>
               <w:color w:val="0070C0"/>
               <w:sz w:val="24"/>
@@ -1299,7 +1367,7 @@
         <w:p>
           <w:pPr>
             <w:rPr>
-              <w:rFonts w:ascii="Times New Roman" w:hAnsi="Times New Roman"/>
+              <w:rFonts w:ascii="Times New Roman" w:hAnsi="Times New Roman" w:cs="Times New Roman"/>
               <w:b/>
               <w:color w:val="0070C0"/>
               <w:sz w:val="24"/>
@@ -1308,7 +1376,7 @@
           </w:pPr>
           <w:r>
             <w:rPr>
-              <w:rFonts w:ascii="Times New Roman" w:hAnsi="Times New Roman"/>
+              <w:rFonts w:ascii="Times New Roman" w:hAnsi="Times New Roman" w:cs="Times New Roman"/>
               <w:b/>
               <w:color w:val="0070C0"/>
               <w:sz w:val="24"/>
@@ -1320,7 +1388,7 @@
         <w:p>
           <w:pPr>
             <w:rPr>
-              <w:rFonts w:ascii="Times New Roman" w:hAnsi="Times New Roman"/>
+              <w:rFonts w:ascii="Times New Roman" w:hAnsi="Times New Roman" w:cs="Times New Roman"/>
               <w:b/>
               <w:color w:val="0070C0"/>
               <w:sz w:val="30"/>
@@ -1329,7 +1397,7 @@
           </w:pPr>
           <w:r>
             <w:rPr>
-              <w:rFonts w:ascii="Times New Roman" w:hAnsi="Times New Roman"/>
+              <w:rFonts w:ascii="Times New Roman" w:hAnsi="Times New Roman" w:cs="Times New Roman"/>
               <w:b/>
               <w:color w:val="0070C0"/>
               <w:sz w:val="30"/>
@@ -1347,7 +1415,7 @@
           <w:pPr>
             <w:jc w:val="right"/>
             <w:rPr>
-              <w:rFonts w:ascii="Times New Roman" w:hAnsi="Times New Roman"/>
+              <w:rFonts w:ascii="Times New Roman" w:hAnsi="Times New Roman" w:cs="Times New Roman"/>
               <w:color w:val="0070C0"/>
               <w:sz w:val="18"/>
               <w:szCs w:val="18"/>
@@ -1358,7 +1426,7 @@
           <w:pPr>
             <w:jc w:val="right"/>
             <w:rPr>
-              <w:rFonts w:ascii="Times New Roman" w:hAnsi="Times New Roman"/>
+              <w:rFonts w:ascii="Times New Roman" w:hAnsi="Times New Roman" w:cs="Times New Roman"/>
               <w:color w:val="0070C0"/>
               <w:sz w:val="18"/>
               <w:szCs w:val="18"/>
@@ -1369,7 +1437,7 @@
           <w:pPr>
             <w:jc w:val="right"/>
             <w:rPr>
-              <w:rFonts w:ascii="Times New Roman" w:hAnsi="Times New Roman"/>
+              <w:rFonts w:ascii="Times New Roman" w:hAnsi="Times New Roman" w:cs="Times New Roman"/>
               <w:color w:val="0070C0"/>
               <w:sz w:val="18"/>
               <w:szCs w:val="18"/>
@@ -1380,7 +1448,7 @@
           <w:pPr>
             <w:jc w:val="right"/>
             <w:rPr>
-              <w:rFonts w:ascii="Times New Roman" w:hAnsi="Times New Roman"/>
+              <w:rFonts w:ascii="Times New Roman" w:hAnsi="Times New Roman" w:cs="Times New Roman"/>
               <w:color w:val="0070C0"/>
               <w:sz w:val="18"/>
               <w:szCs w:val="18"/>
@@ -1388,19 +1456,70 @@
           </w:pPr>
           <w:r>
             <w:rPr>
-              <w:rFonts w:ascii="Times New Roman" w:hAnsi="Times New Roman"/>
+              <w:rFonts w:ascii="Times New Roman" w:hAnsi="Times New Roman" w:cs="Times New Roman"/>
               <w:color w:val="0070C0"/>
               <w:sz w:val="18"/>
               <w:szCs w:val="18"/>
             </w:rPr>
-            <w:t>Jalan Prof. Sudarto, S.H.</w:t>
+            <w:t xml:space="preserve">Jalan Prof. </w:t>
+          </w:r>
+          <w:proofErr w:type="spellStart"/>
+          <w:r>
+            <w:rPr>
+              <w:rFonts w:ascii="Times New Roman" w:hAnsi="Times New Roman" w:cs="Times New Roman"/>
+              <w:color w:val="0070C0"/>
+              <w:sz w:val="18"/>
+              <w:szCs w:val="18"/>
+            </w:rPr>
+            <w:t>Sudarto</w:t>
+          </w:r>
+          <w:proofErr w:type="spellEnd"/>
+          <w:r>
+            <w:rPr>
+              <w:rFonts w:ascii="Times New Roman" w:hAnsi="Times New Roman" w:cs="Times New Roman"/>
+              <w:color w:val="0070C0"/>
+              <w:sz w:val="18"/>
+              <w:szCs w:val="18"/>
+            </w:rPr>
+            <w:t>, S.H.</w:t>
           </w:r>
         </w:p>
         <w:p>
           <w:pPr>
             <w:jc w:val="right"/>
             <w:rPr>
-              <w:rFonts w:ascii="Times New Roman" w:hAnsi="Times New Roman"/>
+              <w:rFonts w:ascii="Times New Roman" w:hAnsi="Times New Roman" w:cs="Times New Roman"/>
+              <w:color w:val="0070C0"/>
+              <w:sz w:val="18"/>
+              <w:szCs w:val="18"/>
+            </w:rPr>
+          </w:pPr>
+          <w:proofErr w:type="spellStart"/>
+          <w:r>
+            <w:rPr>
+              <w:rFonts w:ascii="Times New Roman" w:hAnsi="Times New Roman" w:cs="Times New Roman"/>
+              <w:color w:val="0070C0"/>
+              <w:sz w:val="18"/>
+              <w:szCs w:val="18"/>
+            </w:rPr>
+            <w:t>Tembalang</w:t>
+          </w:r>
+          <w:proofErr w:type="spellEnd"/>
+          <w:r>
+            <w:rPr>
+              <w:rFonts w:ascii="Times New Roman" w:hAnsi="Times New Roman" w:cs="Times New Roman"/>
+              <w:color w:val="0070C0"/>
+              <w:sz w:val="18"/>
+              <w:szCs w:val="18"/>
+            </w:rPr>
+            <w:t xml:space="preserve"> Semarang Kode Pos 50275</w:t>
+          </w:r>
+        </w:p>
+        <w:p>
+          <w:pPr>
+            <w:jc w:val="right"/>
+            <w:rPr>
+              <w:rFonts w:ascii="Times New Roman" w:hAnsi="Times New Roman" w:cs="Times New Roman"/>
               <w:color w:val="0070C0"/>
               <w:sz w:val="18"/>
               <w:szCs w:val="18"/>
@@ -1408,39 +1527,39 @@
           </w:pPr>
           <w:r>
             <w:rPr>
-              <w:rFonts w:ascii="Times New Roman" w:hAnsi="Times New Roman"/>
+              <w:rFonts w:ascii="Times New Roman" w:hAnsi="Times New Roman" w:cs="Times New Roman"/>
               <w:color w:val="0070C0"/>
               <w:sz w:val="18"/>
               <w:szCs w:val="18"/>
             </w:rPr>
-            <w:t>Tembalang Semarang Kode Pos 50275</w:t>
+            <w:t xml:space="preserve">Tel. (024) 76480678, </w:t>
+          </w:r>
+          <w:proofErr w:type="spellStart"/>
+          <w:r>
+            <w:rPr>
+              <w:rFonts w:ascii="Times New Roman" w:hAnsi="Times New Roman" w:cs="Times New Roman"/>
+              <w:color w:val="0070C0"/>
+              <w:sz w:val="18"/>
+              <w:szCs w:val="18"/>
+            </w:rPr>
+            <w:t>Faks</w:t>
+          </w:r>
+          <w:proofErr w:type="spellEnd"/>
+          <w:r>
+            <w:rPr>
+              <w:rFonts w:ascii="Times New Roman" w:hAnsi="Times New Roman" w:cs="Times New Roman"/>
+              <w:color w:val="0070C0"/>
+              <w:sz w:val="18"/>
+              <w:szCs w:val="18"/>
+            </w:rPr>
+            <w:t>. (024) 7460053</w:t>
           </w:r>
         </w:p>
         <w:p>
           <w:pPr>
             <w:jc w:val="right"/>
             <w:rPr>
-              <w:rFonts w:ascii="Times New Roman" w:hAnsi="Times New Roman"/>
-              <w:color w:val="0070C0"/>
-              <w:sz w:val="18"/>
-              <w:szCs w:val="18"/>
-            </w:rPr>
-          </w:pPr>
-          <w:r>
-            <w:rPr>
-              <w:rFonts w:ascii="Times New Roman" w:hAnsi="Times New Roman"/>
-              <w:color w:val="0070C0"/>
-              <w:sz w:val="18"/>
-              <w:szCs w:val="18"/>
-            </w:rPr>
-            <w:t>Tel. (024) 76480678, Faks. (024) 7460053</w:t>
-          </w:r>
-        </w:p>
-        <w:p>
-          <w:pPr>
-            <w:jc w:val="right"/>
-            <w:rPr>
-              <w:rFonts w:ascii="Times New Roman" w:hAnsi="Times New Roman"/>
+              <w:rFonts w:ascii="Times New Roman" w:hAnsi="Times New Roman" w:cs="Times New Roman"/>
               <w:color w:val="0070C0"/>
               <w:sz w:val="18"/>
               <w:szCs w:val="18"/>
@@ -1449,7 +1568,7 @@
           <w:hyperlink r:id="rId2" w:history="1">
             <w:r>
               <w:rPr>
-                <w:rFonts w:ascii="Times New Roman" w:hAnsi="Times New Roman"/>
+                <w:rFonts w:ascii="Times New Roman" w:hAnsi="Times New Roman" w:cs="Times New Roman"/>
                 <w:color w:val="0070C0"/>
                 <w:sz w:val="18"/>
                 <w:szCs w:val="18"/>
@@ -1460,7 +1579,7 @@
           </w:hyperlink>
           <w:r>
             <w:rPr>
-              <w:rFonts w:ascii="Times New Roman" w:hAnsi="Times New Roman"/>
+              <w:rFonts w:ascii="Times New Roman" w:hAnsi="Times New Roman" w:cs="Times New Roman"/>
               <w:color w:val="0070C0"/>
               <w:sz w:val="18"/>
               <w:szCs w:val="18"/>
@@ -1473,6 +1592,19 @@
     <w:bookmarkEnd w:id="0"/>
     <w:bookmarkEnd w:id="1"/>
   </w:tbl>
+  <w:p>
+    <w:pPr>
+      <w:pStyle w:val="Header"/>
+      <w:rPr>
+        <w:rFonts w:ascii="Times New Roman" w:hAnsi="Times New Roman" w:cs="Times New Roman"/>
+      </w:rPr>
+    </w:pPr>
+  </w:p>
+</w:hdr>
+</file>
+
+<file path=word/header3.xml><?xml version="1.0" encoding="utf-8"?>
+<w:hdr xmlns:wpc="http://schemas.microsoft.com/office/word/2010/wordprocessingCanvas" xmlns:cx="http://schemas.microsoft.com/office/drawing/2014/chartex" xmlns:cx1="http://schemas.microsoft.com/office/drawing/2015/9/8/chartex" xmlns:cx2="http://schemas.microsoft.com/office/drawing/2015/10/21/chartex" xmlns:cx3="http://schemas.microsoft.com/office/drawing/2016/5/9/chartex" xmlns:cx4="http://schemas.microsoft.com/office/drawing/2016/5/10/chartex" xmlns:cx5="http://schemas.microsoft.com/office/drawing/2016/5/11/chartex" xmlns:cx6="http://schemas.microsoft.com/office/drawing/2016/5/12/chartex" xmlns:cx7="http://schemas.microsoft.com/office/drawing/2016/5/13/chartex" xmlns:cx8="http://schemas.microsoft.com/office/drawing/2016/5/14/chartex" xmlns:mc="http://schemas.openxmlformats.org/markup-compatibility/2006" xmlns:aink="http://schemas.microsoft.com/office/drawing/2016/ink" xmlns:am3d="http://schemas.microsoft.com/office/drawing/2017/model3d" xmlns:o="urn:schemas-microsoft-com:office:office" xmlns:oel="http://schemas.microsoft.com/office/2019/extlst" xmlns:r="http://schemas.openxmlformats.org/officeDocument/2006/relationships" xmlns:m="http://schemas.openxmlformats.org/officeDocument/2006/math" xmlns:v="urn:schemas-microsoft-com:vml" xmlns:wp14="http://schemas.microsoft.com/office/word/2010/wordprocessingDrawing" xmlns:wp="http://schemas.openxmlformats.org/drawingml/2006/wordprocessingDrawing" xmlns:w10="urn:schemas-microsoft-com:office:word" xmlns:w="http://schemas.openxmlformats.org/wordprocessingml/2006/main" xmlns:w14="http://schemas.microsoft.com/office/word/2010/wordml" xmlns:w15="http://schemas.microsoft.com/office/word/2012/wordml" xmlns:w16cex="http://schemas.microsoft.com/office/word/2018/wordml/cex" xmlns:w16cid="http://schemas.microsoft.com/office/word/2016/wordml/cid" xmlns:w16="http://schemas.microsoft.com/office/word/2018/wordml" xmlns:w16du="http://schemas.microsoft.com/office/word/2023/wordml/word16du" xmlns:w16sdtdh="http://schemas.microsoft.com/office/word/2020/wordml/sdtdatahash" xmlns:w16sdtfl="http://schemas.microsoft.com/office/word/2024/wordml/sdtformatlock" xmlns:w16se="http://schemas.microsoft.com/office/word/2015/wordml/symex" xmlns:wpg="http://schemas.microsoft.com/office/word/2010/wordprocessingGroup" xmlns:wpi="http://schemas.microsoft.com/office/word/2010/wordprocessingInk" xmlns:wne="http://schemas.microsoft.com/office/word/2006/wordml" xmlns:wps="http://schemas.microsoft.com/office/word/2010/wordprocessingShape" mc:Ignorable="w14 w15 w16se w16cid w16 w16cex w16sdtdh w16sdtfl w16du wp14">
   <w:p>
     <w:pPr>
       <w:pStyle w:val="Header"/>

</xml_diff>